<commit_message>
made changes to internship details and added methodology
</commit_message>
<xml_diff>
--- a/Current Resume_3:15:25.docx
+++ b/Current Resume_3:15:25.docx
@@ -250,15 +250,23 @@
                 <w:sz w:val="21"/>
                 <w:szCs w:val="21"/>
               </w:rPr>
-              <w:t>June 202</w:t>
-            </w:r>
-            <w:r>
-              <w:rPr>
-                <w:rFonts w:ascii="Calibri" w:hAnsi="Calibri" w:cs="Calibri"/>
-                <w:sz w:val="21"/>
-                <w:szCs w:val="21"/>
-              </w:rPr>
-              <w:t>7</w:t>
+              <w:t>December</w:t>
+            </w:r>
+            <w:r>
+              <w:rPr>
+                <w:rFonts w:ascii="Calibri" w:hAnsi="Calibri" w:cs="Calibri"/>
+                <w:sz w:val="21"/>
+                <w:szCs w:val="21"/>
+              </w:rPr>
+              <w:t xml:space="preserve"> 202</w:t>
+            </w:r>
+            <w:r>
+              <w:rPr>
+                <w:rFonts w:ascii="Calibri" w:hAnsi="Calibri" w:cs="Calibri"/>
+                <w:sz w:val="21"/>
+                <w:szCs w:val="21"/>
+              </w:rPr>
+              <w:t>6</w:t>
             </w:r>
             <w:r>
               <w:rPr>
@@ -292,15 +300,6 @@
               </w:rPr>
               <w:t>Pursuing B.S. Informatics (AI/ML focused) &amp; Computer Science.</w:t>
             </w:r>
-          </w:p>
-          <w:p>
-            <w:pPr>
-              <w:rPr>
-                <w:rFonts w:ascii="Calibri" w:hAnsi="Calibri" w:cs="Calibri"/>
-                <w:sz w:val="21"/>
-                <w:szCs w:val="21"/>
-              </w:rPr>
-            </w:pPr>
           </w:p>
         </w:tc>
         <w:tc>
@@ -433,39 +432,7 @@
                 <w:sz w:val="21"/>
                 <w:szCs w:val="21"/>
               </w:rPr>
-              <w:t xml:space="preserve">, AWS Machine Learning </w:t>
-            </w:r>
-            <w:r>
-              <w:rPr>
-                <w:rFonts w:ascii="Calibri" w:hAnsi="Calibri" w:cs="Calibri"/>
-                <w:sz w:val="21"/>
-                <w:szCs w:val="21"/>
-              </w:rPr>
-              <w:t xml:space="preserve">Engineer </w:t>
-            </w:r>
-            <w:r>
-              <w:rPr>
-                <w:rFonts w:ascii="Calibri" w:hAnsi="Calibri" w:cs="Calibri"/>
-                <w:sz w:val="21"/>
-                <w:szCs w:val="21"/>
-              </w:rPr>
-              <w:t xml:space="preserve">(expected </w:t>
-            </w:r>
-            <w:r>
-              <w:rPr>
-                <w:rFonts w:ascii="Calibri" w:hAnsi="Calibri" w:cs="Calibri"/>
-                <w:sz w:val="21"/>
-                <w:szCs w:val="21"/>
-              </w:rPr>
-              <w:t>November</w:t>
-            </w:r>
-            <w:r>
-              <w:rPr>
-                <w:rFonts w:ascii="Calibri" w:hAnsi="Calibri" w:cs="Calibri"/>
-                <w:sz w:val="21"/>
-                <w:szCs w:val="21"/>
-              </w:rPr>
-              <w:t xml:space="preserve"> 2025), </w:t>
+              <w:t xml:space="preserve">, </w:t>
             </w:r>
             <w:r>
               <w:rPr>
@@ -548,41 +515,52 @@
         <w:tblLook w:val="04A0" w:firstRow="1" w:lastRow="0" w:firstColumn="1" w:lastColumn="0" w:noHBand="0" w:noVBand="1"/>
       </w:tblPr>
       <w:tblGrid>
-        <w:gridCol w:w="6125"/>
-        <w:gridCol w:w="540"/>
+        <w:gridCol w:w="5585"/>
+        <w:gridCol w:w="1080"/>
         <w:gridCol w:w="4135"/>
       </w:tblGrid>
       <w:tr>
         <w:tc>
           <w:tcPr>
-            <w:tcW w:w="6125" w:type="dxa"/>
+            <w:tcW w:w="5585" w:type="dxa"/>
           </w:tcPr>
           <w:p>
             <w:pPr>
               <w:rPr>
                 <w:rFonts w:ascii="Calibri" w:hAnsi="Calibri" w:cs="Calibri"/>
+              </w:rPr>
+            </w:pPr>
+            <w:r>
+              <w:rPr>
+                <w:rFonts w:ascii="Calibri" w:hAnsi="Calibri" w:cs="Calibri"/>
                 <w:b/>
                 <w:bCs/>
               </w:rPr>
-            </w:pPr>
+              <w:t>Tech Mahindra</w:t>
+            </w:r>
             <w:r>
               <w:rPr>
                 <w:rFonts w:ascii="Calibri" w:hAnsi="Calibri" w:cs="Calibri"/>
                 <w:b/>
                 <w:bCs/>
               </w:rPr>
-              <w:t>Tech Mahindra</w:t>
+              <w:t xml:space="preserve"> - </w:t>
+            </w:r>
+            <w:r>
+              <w:rPr>
+                <w:rFonts w:ascii="Calibri" w:hAnsi="Calibri" w:cs="Calibri"/>
+              </w:rPr>
+              <w:t>Verizon client</w:t>
             </w:r>
           </w:p>
         </w:tc>
         <w:tc>
           <w:tcPr>
-            <w:tcW w:w="4675" w:type="dxa"/>
+            <w:tcW w:w="5215" w:type="dxa"/>
             <w:gridSpan w:val="2"/>
           </w:tcPr>
           <w:p>
             <w:pPr>
-              <w:jc w:val="right"/>
               <w:rPr>
                 <w:rFonts w:ascii="Calibri" w:hAnsi="Calibri" w:cs="Calibri"/>
               </w:rPr>
@@ -591,7 +569,25 @@
               <w:rPr>
                 <w:rFonts w:ascii="Calibri" w:hAnsi="Calibri" w:cs="Calibri"/>
               </w:rPr>
-              <w:t>Current – August 2025 (extended till October)</w:t>
+              <w:t>June 2025</w:t>
+            </w:r>
+            <w:r>
+              <w:rPr>
+                <w:rFonts w:ascii="Calibri" w:hAnsi="Calibri" w:cs="Calibri"/>
+              </w:rPr>
+              <w:t xml:space="preserve"> – August 2025 (extended till </w:t>
+            </w:r>
+            <w:r>
+              <w:rPr>
+                <w:rFonts w:ascii="Calibri" w:hAnsi="Calibri" w:cs="Calibri"/>
+              </w:rPr>
+              <w:t>December</w:t>
+            </w:r>
+            <w:r>
+              <w:rPr>
+                <w:rFonts w:ascii="Calibri" w:hAnsi="Calibri" w:cs="Calibri"/>
+              </w:rPr>
+              <w:t>)</w:t>
             </w:r>
           </w:p>
         </w:tc>
@@ -638,7 +634,83 @@
                 <w:sz w:val="21"/>
                 <w:szCs w:val="21"/>
               </w:rPr>
-              <w:t>Built RESTful APIs with full CRUD functionality to support scalable multi-account architecture.</w:t>
+              <w:t xml:space="preserve">Developed and deployed </w:t>
+            </w:r>
+            <w:r>
+              <w:rPr>
+                <w:rFonts w:ascii="Calibri" w:hAnsi="Calibri" w:cs="Calibri"/>
+                <w:b/>
+                <w:bCs/>
+                <w:sz w:val="21"/>
+                <w:szCs w:val="21"/>
+              </w:rPr>
+              <w:t>20</w:t>
+            </w:r>
+            <w:r>
+              <w:rPr>
+                <w:rFonts w:ascii="Calibri" w:hAnsi="Calibri" w:cs="Calibri"/>
+                <w:sz w:val="21"/>
+                <w:szCs w:val="21"/>
+              </w:rPr>
+              <w:t>+</w:t>
+            </w:r>
+            <w:r>
+              <w:rPr>
+                <w:rFonts w:ascii="Calibri" w:hAnsi="Calibri" w:cs="Calibri"/>
+                <w:sz w:val="21"/>
+                <w:szCs w:val="21"/>
+              </w:rPr>
+              <w:t xml:space="preserve"> </w:t>
+            </w:r>
+            <w:r>
+              <w:rPr>
+                <w:rFonts w:ascii="Calibri" w:hAnsi="Calibri" w:cs="Calibri"/>
+                <w:b/>
+                <w:bCs/>
+                <w:sz w:val="21"/>
+                <w:szCs w:val="21"/>
+              </w:rPr>
+              <w:t>RESTful APIs</w:t>
+            </w:r>
+            <w:r>
+              <w:rPr>
+                <w:rFonts w:ascii="Calibri" w:hAnsi="Calibri" w:cs="Calibri"/>
+                <w:sz w:val="21"/>
+                <w:szCs w:val="21"/>
+              </w:rPr>
+              <w:t xml:space="preserve"> </w:t>
+            </w:r>
+            <w:r>
+              <w:rPr>
+                <w:rFonts w:ascii="Calibri" w:hAnsi="Calibri" w:cs="Calibri"/>
+                <w:sz w:val="21"/>
+                <w:szCs w:val="21"/>
+              </w:rPr>
+              <w:t xml:space="preserve">in Java using Spring boot framework </w:t>
+            </w:r>
+            <w:r>
+              <w:rPr>
+                <w:rFonts w:ascii="Calibri" w:hAnsi="Calibri" w:cs="Calibri"/>
+                <w:sz w:val="21"/>
+                <w:szCs w:val="21"/>
+              </w:rPr>
+              <w:t xml:space="preserve">to support </w:t>
+            </w:r>
+            <w:r>
+              <w:rPr>
+                <w:rFonts w:ascii="Calibri" w:hAnsi="Calibri" w:cs="Calibri"/>
+                <w:sz w:val="21"/>
+                <w:szCs w:val="21"/>
+              </w:rPr>
+              <w:t xml:space="preserve">Verizon’s </w:t>
+            </w:r>
+            <w:r>
+              <w:rPr>
+                <w:rFonts w:ascii="Calibri" w:hAnsi="Calibri" w:cs="Calibri"/>
+                <w:sz w:val="21"/>
+                <w:szCs w:val="21"/>
+              </w:rPr>
+              <w:t>scalable multi-account architecture.</w:t>
             </w:r>
           </w:p>
           <w:p>
@@ -660,7 +732,15 @@
                 <w:sz w:val="21"/>
                 <w:szCs w:val="21"/>
               </w:rPr>
-              <w:t>Implemented input validation and exception handling to improve reliability and user experience.</w:t>
+              <w:t>Enhanced API functionality by enabling list-based requests to filter data by multiple values</w:t>
+            </w:r>
+            <w:r>
+              <w:rPr>
+                <w:rFonts w:ascii="Calibri" w:hAnsi="Calibri" w:cs="Calibri"/>
+                <w:sz w:val="21"/>
+                <w:szCs w:val="21"/>
+              </w:rPr>
+              <w:t>.</w:t>
             </w:r>
           </w:p>
           <w:p>
@@ -682,25 +762,31 @@
                 <w:sz w:val="21"/>
                 <w:szCs w:val="21"/>
               </w:rPr>
-              <w:t>Built authentication and authorization layers to</w:t>
-            </w:r>
-            <w:r>
-              <w:rPr>
-                <w:rFonts w:ascii="Calibri" w:hAnsi="Calibri" w:cs="Calibri"/>
-                <w:b/>
-                <w:bCs/>
-                <w:sz w:val="21"/>
-                <w:szCs w:val="21"/>
-              </w:rPr>
-              <w:t xml:space="preserve"> </w:t>
-            </w:r>
-            <w:r>
-              <w:rPr>
-                <w:rFonts w:ascii="Calibri" w:hAnsi="Calibri" w:cs="Calibri"/>
-                <w:sz w:val="21"/>
-                <w:szCs w:val="21"/>
-              </w:rPr>
-              <w:t>secure API endpoints.</w:t>
+              <w:t>Integrated API</w:t>
+            </w:r>
+            <w:r>
+              <w:rPr>
+                <w:rFonts w:ascii="Calibri" w:hAnsi="Calibri" w:cs="Calibri"/>
+                <w:sz w:val="21"/>
+                <w:szCs w:val="21"/>
+              </w:rPr>
+              <w:t>s</w:t>
+            </w:r>
+            <w:r>
+              <w:rPr>
+                <w:rFonts w:ascii="Calibri" w:hAnsi="Calibri" w:cs="Calibri"/>
+                <w:sz w:val="21"/>
+                <w:szCs w:val="21"/>
+              </w:rPr>
+              <w:t xml:space="preserve"> with Oracles databases, </w:t>
+            </w:r>
+            <w:r>
+              <w:rPr>
+                <w:rFonts w:ascii="Calibri" w:hAnsi="Calibri" w:cs="Calibri"/>
+                <w:sz w:val="21"/>
+                <w:szCs w:val="21"/>
+              </w:rPr>
+              <w:t>and validated endpoints using Swagger and Postman.</w:t>
             </w:r>
           </w:p>
         </w:tc>
@@ -747,39 +833,59 @@
                 <w:sz w:val="21"/>
                 <w:szCs w:val="21"/>
               </w:rPr>
-              <w:t>Develop</w:t>
-            </w:r>
-            <w:r>
-              <w:rPr>
-                <w:rFonts w:ascii="Calibri" w:hAnsi="Calibri" w:cs="Calibri"/>
-                <w:sz w:val="21"/>
-                <w:szCs w:val="21"/>
-              </w:rPr>
-              <w:t>ed</w:t>
-            </w:r>
-            <w:r>
-              <w:rPr>
-                <w:rFonts w:ascii="Calibri" w:hAnsi="Calibri" w:cs="Calibri"/>
-                <w:sz w:val="21"/>
-                <w:szCs w:val="21"/>
-              </w:rPr>
-              <w:t xml:space="preserve"> and deploy</w:t>
-            </w:r>
-            <w:r>
-              <w:rPr>
-                <w:rFonts w:ascii="Calibri" w:hAnsi="Calibri" w:cs="Calibri"/>
-                <w:sz w:val="21"/>
-                <w:szCs w:val="21"/>
-              </w:rPr>
-              <w:t>ed</w:t>
-            </w:r>
-            <w:r>
-              <w:rPr>
-                <w:rFonts w:ascii="Calibri" w:hAnsi="Calibri" w:cs="Calibri"/>
-                <w:sz w:val="21"/>
-                <w:szCs w:val="21"/>
-              </w:rPr>
-              <w:t xml:space="preserve"> AI agents to make strategic decisions on company’s behalf.</w:t>
+              <w:t>Contr</w:t>
+            </w:r>
+            <w:r>
+              <w:rPr>
+                <w:rFonts w:ascii="Calibri" w:hAnsi="Calibri" w:cs="Calibri"/>
+                <w:sz w:val="21"/>
+                <w:szCs w:val="21"/>
+              </w:rPr>
+              <w:t>ibuted</w:t>
+            </w:r>
+            <w:r>
+              <w:rPr>
+                <w:rFonts w:ascii="Calibri" w:hAnsi="Calibri" w:cs="Calibri"/>
+                <w:b/>
+                <w:bCs/>
+                <w:sz w:val="21"/>
+                <w:szCs w:val="21"/>
+              </w:rPr>
+              <w:t xml:space="preserve"> </w:t>
+            </w:r>
+            <w:r>
+              <w:rPr>
+                <w:rFonts w:ascii="Calibri" w:hAnsi="Calibri" w:cs="Calibri"/>
+                <w:sz w:val="21"/>
+                <w:szCs w:val="21"/>
+              </w:rPr>
+              <w:t xml:space="preserve">to the high-level architecture design of an </w:t>
+            </w:r>
+            <w:r>
+              <w:rPr>
+                <w:rFonts w:ascii="Calibri" w:hAnsi="Calibri" w:cs="Calibri"/>
+                <w:b/>
+                <w:bCs/>
+                <w:sz w:val="21"/>
+                <w:szCs w:val="21"/>
+              </w:rPr>
+              <w:t>AI-powered anomaly detection and auto-remediation</w:t>
+            </w:r>
+            <w:r>
+              <w:rPr>
+                <w:rFonts w:ascii="Calibri" w:hAnsi="Calibri" w:cs="Calibri"/>
+                <w:sz w:val="21"/>
+                <w:szCs w:val="21"/>
+              </w:rPr>
+              <w:t xml:space="preserve"> POC</w:t>
+            </w:r>
+            <w:r>
+              <w:rPr>
+                <w:rFonts w:ascii="Calibri" w:hAnsi="Calibri" w:cs="Calibri"/>
+                <w:sz w:val="21"/>
+                <w:szCs w:val="21"/>
+              </w:rPr>
+              <w:t xml:space="preserve">. </w:t>
             </w:r>
           </w:p>
           <w:p>
@@ -801,23 +907,41 @@
                 <w:sz w:val="21"/>
                 <w:szCs w:val="21"/>
               </w:rPr>
-              <w:t xml:space="preserve">Designed AI-powered framework to detect anomalies and surface insights, improving data-driven decision making </w:t>
-            </w:r>
-            <w:r>
-              <w:rPr>
-                <w:rFonts w:ascii="Calibri" w:hAnsi="Calibri" w:cs="Calibri"/>
-                <w:sz w:val="21"/>
-                <w:szCs w:val="21"/>
-              </w:rPr>
-              <w:t>and</w:t>
-            </w:r>
-            <w:r>
-              <w:rPr>
-                <w:rFonts w:ascii="Calibri" w:hAnsi="Calibri" w:cs="Calibri"/>
-                <w:sz w:val="21"/>
-                <w:szCs w:val="21"/>
-              </w:rPr>
-              <w:t xml:space="preserve"> aligning with large-scale educational platforms’ reliability needs.</w:t>
+              <w:t>F</w:t>
+            </w:r>
+            <w:r>
+              <w:rPr>
+                <w:rFonts w:ascii="Calibri" w:hAnsi="Calibri" w:cs="Calibri"/>
+                <w:sz w:val="21"/>
+                <w:szCs w:val="21"/>
+              </w:rPr>
+              <w:t xml:space="preserve">ollowing POC approval, planned responsibilities include training </w:t>
+            </w:r>
+            <w:r>
+              <w:rPr>
+                <w:rFonts w:ascii="Calibri" w:hAnsi="Calibri" w:cs="Calibri"/>
+                <w:b/>
+                <w:bCs/>
+                <w:sz w:val="21"/>
+                <w:szCs w:val="21"/>
+              </w:rPr>
+              <w:t>AWS SageMaker Random Cut Forest</w:t>
+            </w:r>
+            <w:r>
+              <w:rPr>
+                <w:rFonts w:ascii="Calibri" w:hAnsi="Calibri" w:cs="Calibri"/>
+                <w:sz w:val="21"/>
+                <w:szCs w:val="21"/>
+              </w:rPr>
+              <w:t xml:space="preserve"> model, and developing dashboards </w:t>
+            </w:r>
+            <w:r>
+              <w:rPr>
+                <w:rFonts w:ascii="Calibri" w:hAnsi="Calibri" w:cs="Calibri"/>
+                <w:sz w:val="21"/>
+                <w:szCs w:val="21"/>
+              </w:rPr>
+              <w:t>to display real time detected anomalies.</w:t>
             </w:r>
           </w:p>
         </w:tc>
@@ -994,110 +1118,6 @@
                 <w:szCs w:val="21"/>
               </w:rPr>
               <w:t>to auto-generate content and publish it across multiple social media platforms using a single input from the owner.</w:t>
-            </w:r>
-          </w:p>
-        </w:tc>
-      </w:tr>
-      <w:tr>
-        <w:tc>
-          <w:tcPr>
-            <w:tcW w:w="6665" w:type="dxa"/>
-            <w:gridSpan w:val="2"/>
-          </w:tcPr>
-          <w:p>
-            <w:pPr>
-              <w:rPr>
-                <w:rFonts w:ascii="Calibri" w:hAnsi="Calibri" w:cs="Calibri"/>
-                <w:i/>
-                <w:iCs/>
-              </w:rPr>
-            </w:pPr>
-            <w:r>
-              <w:rPr>
-                <w:rFonts w:ascii="Calibri" w:hAnsi="Calibri" w:cs="Calibri"/>
-                <w:b/>
-                <w:bCs/>
-              </w:rPr>
-              <w:t xml:space="preserve">Coding Club Teaching Assistant - </w:t>
-            </w:r>
-            <w:r>
-              <w:rPr>
-                <w:rFonts w:ascii="Calibri" w:hAnsi="Calibri" w:cs="Calibri"/>
-                <w:i/>
-                <w:iCs/>
-              </w:rPr>
-              <w:t>House of Wisdom</w:t>
-            </w:r>
-          </w:p>
-        </w:tc>
-        <w:tc>
-          <w:tcPr>
-            <w:tcW w:w="4135" w:type="dxa"/>
-          </w:tcPr>
-          <w:p>
-            <w:pPr>
-              <w:jc w:val="right"/>
-              <w:rPr>
-                <w:rFonts w:ascii="Calibri" w:hAnsi="Calibri" w:cs="Calibri"/>
-              </w:rPr>
-            </w:pPr>
-            <w:r>
-              <w:rPr>
-                <w:rFonts w:ascii="Calibri" w:hAnsi="Calibri" w:cs="Calibri"/>
-              </w:rPr>
-              <w:t>March 2024 – June 2024</w:t>
-            </w:r>
-          </w:p>
-        </w:tc>
-      </w:tr>
-      <w:tr>
-        <w:tc>
-          <w:tcPr>
-            <w:tcW w:w="10800" w:type="dxa"/>
-            <w:gridSpan w:val="3"/>
-          </w:tcPr>
-          <w:p>
-            <w:pPr>
-              <w:pStyle w:val="ListParagraph"/>
-              <w:numPr>
-                <w:ilvl w:val="0"/>
-                <w:numId w:val="4"/>
-              </w:numPr>
-              <w:rPr>
-                <w:rFonts w:ascii="Calibri" w:hAnsi="Calibri" w:cs="Calibri"/>
-                <w:sz w:val="21"/>
-                <w:szCs w:val="21"/>
-              </w:rPr>
-            </w:pPr>
-            <w:r>
-              <w:rPr>
-                <w:rFonts w:ascii="Calibri" w:hAnsi="Calibri" w:cs="Calibri"/>
-                <w:sz w:val="21"/>
-                <w:szCs w:val="21"/>
-              </w:rPr>
-              <w:t>Taught programming and mentored school aged students to navigate new skills in coding.</w:t>
-            </w:r>
-          </w:p>
-          <w:p>
-            <w:pPr>
-              <w:pStyle w:val="ListParagraph"/>
-              <w:numPr>
-                <w:ilvl w:val="0"/>
-                <w:numId w:val="4"/>
-              </w:numPr>
-              <w:rPr>
-                <w:rFonts w:ascii="Calibri" w:hAnsi="Calibri" w:cs="Calibri"/>
-                <w:sz w:val="21"/>
-                <w:szCs w:val="21"/>
-              </w:rPr>
-            </w:pPr>
-            <w:r>
-              <w:rPr>
-                <w:rFonts w:ascii="Calibri" w:hAnsi="Calibri" w:cs="Calibri"/>
-                <w:sz w:val="21"/>
-                <w:szCs w:val="21"/>
-              </w:rPr>
-              <w:t>Collaborated with peers to design lesson plans and received constructive feedback from instructor.</w:t>
             </w:r>
           </w:p>
         </w:tc>
@@ -1642,15 +1662,7 @@
                 <w:sz w:val="21"/>
                 <w:szCs w:val="21"/>
               </w:rPr>
-              <w:t xml:space="preserve"> Created custom GPTs for domain-specific tasks in academics, professional work, and </w:t>
-            </w:r>
-            <w:r>
-              <w:rPr>
-                <w:rFonts w:ascii="Calibri" w:hAnsi="Calibri" w:cs="Calibri"/>
-                <w:sz w:val="21"/>
-                <w:szCs w:val="21"/>
-              </w:rPr>
-              <w:t>routine tasks.</w:t>
+              <w:t xml:space="preserve"> Created custom GPTs for domain-specific tasks in academics, professional work, and routine tasks.</w:t>
             </w:r>
           </w:p>
           <w:p>
@@ -1714,13 +1726,63 @@
             <w:pPr>
               <w:rPr>
                 <w:rFonts w:ascii="Calibri" w:hAnsi="Calibri" w:cs="Calibri"/>
+                <w:sz w:val="21"/>
+                <w:szCs w:val="21"/>
+              </w:rPr>
+            </w:pPr>
+            <w:r>
+              <w:rPr>
+                <w:rFonts w:ascii="Calibri" w:hAnsi="Calibri" w:cs="Calibri"/>
                 <w:b/>
                 <w:bCs/>
                 <w:sz w:val="21"/>
                 <w:szCs w:val="21"/>
               </w:rPr>
-            </w:pPr>
-            <w:r>
+              <w:t xml:space="preserve">Tools: </w:t>
+            </w:r>
+            <w:r>
+              <w:rPr>
+                <w:rFonts w:ascii="Calibri" w:hAnsi="Calibri" w:cs="Calibri"/>
+                <w:sz w:val="21"/>
+                <w:szCs w:val="21"/>
+              </w:rPr>
+              <w:t xml:space="preserve">Amazon Q &amp; GitHub co-pilot for faster development; </w:t>
+            </w:r>
+            <w:r>
+              <w:rPr>
+                <w:rFonts w:ascii="Calibri" w:hAnsi="Calibri" w:cs="Calibri"/>
+                <w:sz w:val="21"/>
+                <w:szCs w:val="21"/>
+              </w:rPr>
+              <w:t xml:space="preserve">Git &amp; GitHub for version controlling and collaboration; </w:t>
+            </w:r>
+            <w:r>
+              <w:rPr>
+                <w:rFonts w:ascii="Calibri" w:hAnsi="Calibri" w:cs="Calibri"/>
+                <w:sz w:val="21"/>
+                <w:szCs w:val="21"/>
+              </w:rPr>
+              <w:t xml:space="preserve">Postman &amp; Swagger for testing API </w:t>
+            </w:r>
+            <w:r>
+              <w:rPr>
+                <w:rFonts w:ascii="Calibri" w:hAnsi="Calibri" w:cs="Calibri"/>
+                <w:sz w:val="21"/>
+                <w:szCs w:val="21"/>
+              </w:rPr>
+              <w:t>endpoints.</w:t>
+            </w:r>
+            <w:r>
+              <w:rPr>
+                <w:rFonts w:ascii="Calibri" w:hAnsi="Calibri" w:cs="Calibri"/>
+                <w:sz w:val="21"/>
+                <w:szCs w:val="21"/>
+              </w:rPr>
+              <w:t xml:space="preserve"> </w:t>
+            </w:r>
+          </w:p>
+          <w:p>
+            <w:pPr>
               <w:rPr>
                 <w:rFonts w:ascii="Calibri" w:hAnsi="Calibri" w:cs="Calibri"/>
                 <w:b/>
@@ -1728,47 +1790,52 @@
                 <w:sz w:val="21"/>
                 <w:szCs w:val="21"/>
               </w:rPr>
-              <w:t xml:space="preserve">Tools: </w:t>
-            </w:r>
-            <w:r>
-              <w:rPr>
-                <w:rFonts w:ascii="Calibri" w:hAnsi="Calibri" w:cs="Calibri"/>
-                <w:sz w:val="21"/>
-                <w:szCs w:val="21"/>
-              </w:rPr>
-              <w:t xml:space="preserve">Amazon Q &amp; GitHub co-pilot for faster development; </w:t>
-            </w:r>
-            <w:r>
-              <w:rPr>
-                <w:rFonts w:ascii="Calibri" w:hAnsi="Calibri" w:cs="Calibri"/>
-                <w:sz w:val="21"/>
-                <w:szCs w:val="21"/>
-              </w:rPr>
-              <w:t xml:space="preserve">Git &amp; GitHub for version controlling and collaboration; </w:t>
-            </w:r>
-            <w:r>
-              <w:rPr>
-                <w:rFonts w:ascii="Calibri" w:hAnsi="Calibri" w:cs="Calibri"/>
-                <w:sz w:val="21"/>
-                <w:szCs w:val="21"/>
-              </w:rPr>
-              <w:t xml:space="preserve">Postman &amp; Swagger for testing API </w:t>
-            </w:r>
-            <w:r>
-              <w:rPr>
-                <w:rFonts w:ascii="Calibri" w:hAnsi="Calibri" w:cs="Calibri"/>
-                <w:sz w:val="21"/>
-                <w:szCs w:val="21"/>
-              </w:rPr>
-              <w:t>endpoints.</w:t>
-            </w:r>
-            <w:r>
-              <w:rPr>
-                <w:rFonts w:ascii="Calibri" w:hAnsi="Calibri" w:cs="Calibri"/>
-                <w:sz w:val="21"/>
-                <w:szCs w:val="21"/>
-              </w:rPr>
-              <w:t xml:space="preserve"> </w:t>
+            </w:pPr>
+            <w:r>
+              <w:rPr>
+                <w:rFonts w:ascii="Calibri" w:hAnsi="Calibri" w:cs="Calibri"/>
+                <w:b/>
+                <w:bCs/>
+                <w:sz w:val="21"/>
+                <w:szCs w:val="21"/>
+              </w:rPr>
+              <w:t>Methodol</w:t>
+            </w:r>
+            <w:r>
+              <w:rPr>
+                <w:rFonts w:ascii="Calibri" w:hAnsi="Calibri" w:cs="Calibri"/>
+                <w:b/>
+                <w:bCs/>
+                <w:sz w:val="21"/>
+                <w:szCs w:val="21"/>
+              </w:rPr>
+              <w:t xml:space="preserve">ogies: </w:t>
+            </w:r>
+            <w:r>
+              <w:rPr>
+                <w:rFonts w:ascii="Calibri" w:hAnsi="Calibri" w:cs="Calibri"/>
+                <w:sz w:val="21"/>
+                <w:szCs w:val="21"/>
+              </w:rPr>
+              <w:t xml:space="preserve">hybrid </w:t>
+            </w:r>
+            <w:r>
+              <w:rPr>
+                <w:rFonts w:ascii="Calibri" w:hAnsi="Calibri" w:cs="Calibri"/>
+                <w:b/>
+                <w:bCs/>
+                <w:sz w:val="21"/>
+                <w:szCs w:val="21"/>
+              </w:rPr>
+              <w:t>Water-Scrum-Fall</w:t>
+            </w:r>
+            <w:r>
+              <w:rPr>
+                <w:rFonts w:ascii="Calibri" w:hAnsi="Calibri" w:cs="Calibri"/>
+                <w:sz w:val="21"/>
+                <w:szCs w:val="21"/>
+              </w:rPr>
+              <w:t xml:space="preserve"> approach used during Tech Mahindra Internship </w:t>
             </w:r>
           </w:p>
         </w:tc>
@@ -3756,6 +3823,17 @@
       <w:shd w:val="clear" w:color="auto" w:fill="E1DFDD"/>
     </w:rPr>
   </w:style>
+  <w:style w:type="character" w:styleId="Strong">
+    <w:name w:val="Strong"/>
+    <w:basedOn w:val="DefaultParagraphFont"/>
+    <w:uiPriority w:val="22"/>
+    <w:qFormat/>
+    <w:rsid w:val="00887863"/>
+    <w:rPr>
+      <w:b/>
+      <w:bCs/>
+    </w:rPr>
+  </w:style>
 </w:styles>
 </file>
 

</xml_diff>

<commit_message>
about to add the new assignment project from cse 415 in the next commit
</commit_message>
<xml_diff>
--- a/Current Resume_3:15:25.docx
+++ b/Current Resume_3:15:25.docx
@@ -250,7 +250,7 @@
                 <w:sz w:val="21"/>
                 <w:szCs w:val="21"/>
               </w:rPr>
-              <w:t>December</w:t>
+              <w:t>June</w:t>
             </w:r>
             <w:r>
               <w:rPr>
@@ -266,7 +266,7 @@
                 <w:sz w:val="21"/>
                 <w:szCs w:val="21"/>
               </w:rPr>
-              <w:t>6</w:t>
+              <w:t>7</w:t>
             </w:r>
             <w:r>
               <w:rPr>
@@ -328,6 +328,8 @@
             <w:pPr>
               <w:rPr>
                 <w:rFonts w:ascii="Calibri" w:hAnsi="Calibri" w:cs="Calibri"/>
+                <w:bCs/>
+                <w:spacing w:val="-10"/>
                 <w:sz w:val="21"/>
                 <w:szCs w:val="21"/>
               </w:rPr>
@@ -473,6 +475,25 @@
                 <w:szCs w:val="21"/>
               </w:rPr>
               <w:t>, Spring Boot REST APIs (Udemy).</w:t>
+            </w:r>
+          </w:p>
+          <w:p>
+            <w:pPr>
+              <w:rPr>
+                <w:rFonts w:ascii="Calibri" w:hAnsi="Calibri" w:cs="Calibri"/>
+                <w:sz w:val="21"/>
+                <w:szCs w:val="21"/>
+              </w:rPr>
+            </w:pPr>
+            <w:r>
+              <w:rPr>
+                <w:rFonts w:ascii="Calibri" w:hAnsi="Calibri" w:cs="Calibri"/>
+                <w:bCs/>
+                <w:spacing w:val="-10"/>
+                <w:sz w:val="21"/>
+                <w:szCs w:val="21"/>
+              </w:rPr>
+              <w:t>Events Attended: AWS PartnerEquip 2025 Bellevue (AI Track), AWS Mastering AI Agents Workshop 2025, AWS Innovate 2025.</w:t>
             </w:r>
           </w:p>
         </w:tc>
@@ -544,6 +565,14 @@
                 <w:b/>
                 <w:bCs/>
               </w:rPr>
+              <w:t xml:space="preserve"> Consulting</w:t>
+            </w:r>
+            <w:r>
+              <w:rPr>
+                <w:rFonts w:ascii="Calibri" w:hAnsi="Calibri" w:cs="Calibri"/>
+                <w:b/>
+                <w:bCs/>
+              </w:rPr>
               <w:t xml:space="preserve"> - </w:t>
             </w:r>
             <w:r>
@@ -561,6 +590,7 @@
           </w:tcPr>
           <w:p>
             <w:pPr>
+              <w:jc w:val="right"/>
               <w:rPr>
                 <w:rFonts w:ascii="Calibri" w:hAnsi="Calibri" w:cs="Calibri"/>
               </w:rPr>
@@ -575,19 +605,13 @@
               <w:rPr>
                 <w:rFonts w:ascii="Calibri" w:hAnsi="Calibri" w:cs="Calibri"/>
               </w:rPr>
-              <w:t xml:space="preserve"> – August 2025 (extended till </w:t>
-            </w:r>
-            <w:r>
-              <w:rPr>
-                <w:rFonts w:ascii="Calibri" w:hAnsi="Calibri" w:cs="Calibri"/>
-              </w:rPr>
-              <w:t>December</w:t>
-            </w:r>
-            <w:r>
-              <w:rPr>
-                <w:rFonts w:ascii="Calibri" w:hAnsi="Calibri" w:cs="Calibri"/>
-              </w:rPr>
-              <w:t>)</w:t>
+              <w:t xml:space="preserve"> – </w:t>
+            </w:r>
+            <w:r>
+              <w:rPr>
+                <w:rFonts w:ascii="Calibri" w:hAnsi="Calibri" w:cs="Calibri"/>
+              </w:rPr>
+              <w:t>October 2025</w:t>
             </w:r>
           </w:p>
         </w:tc>
@@ -778,7 +802,25 @@
                 <w:sz w:val="21"/>
                 <w:szCs w:val="21"/>
               </w:rPr>
-              <w:t xml:space="preserve"> with Oracles databases, </w:t>
+              <w:t xml:space="preserve"> with </w:t>
+            </w:r>
+            <w:r>
+              <w:rPr>
+                <w:rFonts w:ascii="Calibri" w:hAnsi="Calibri" w:cs="Calibri"/>
+                <w:b/>
+                <w:bCs/>
+                <w:sz w:val="21"/>
+                <w:szCs w:val="21"/>
+              </w:rPr>
+              <w:t>Oracles databases</w:t>
+            </w:r>
+            <w:r>
+              <w:rPr>
+                <w:rFonts w:ascii="Calibri" w:hAnsi="Calibri" w:cs="Calibri"/>
+                <w:sz w:val="21"/>
+                <w:szCs w:val="21"/>
+              </w:rPr>
+              <w:t xml:space="preserve">, </w:t>
             </w:r>
             <w:r>
               <w:rPr>
@@ -811,7 +853,15 @@
                 <w:sz w:val="21"/>
                 <w:szCs w:val="21"/>
               </w:rPr>
-              <w:t>AI/ML Engineer Intern (Extended Role)</w:t>
+              <w:t xml:space="preserve">AI/ML Engineer </w:t>
+            </w:r>
+            <w:r>
+              <w:rPr>
+                <w:rFonts w:ascii="Calibri" w:hAnsi="Calibri" w:cs="Calibri"/>
+                <w:sz w:val="21"/>
+                <w:szCs w:val="21"/>
+              </w:rPr>
+              <w:t>Role</w:t>
             </w:r>
           </w:p>
           <w:p>
@@ -833,15 +883,7 @@
                 <w:sz w:val="21"/>
                 <w:szCs w:val="21"/>
               </w:rPr>
-              <w:t>Contr</w:t>
-            </w:r>
-            <w:r>
-              <w:rPr>
-                <w:rFonts w:ascii="Calibri" w:hAnsi="Calibri" w:cs="Calibri"/>
-                <w:sz w:val="21"/>
-                <w:szCs w:val="21"/>
-              </w:rPr>
-              <w:t>ibuted</w:t>
+              <w:t>Contributed</w:t>
             </w:r>
             <w:r>
               <w:rPr>
@@ -907,15 +949,7 @@
                 <w:sz w:val="21"/>
                 <w:szCs w:val="21"/>
               </w:rPr>
-              <w:t>F</w:t>
-            </w:r>
-            <w:r>
-              <w:rPr>
-                <w:rFonts w:ascii="Calibri" w:hAnsi="Calibri" w:cs="Calibri"/>
-                <w:sz w:val="21"/>
-                <w:szCs w:val="21"/>
-              </w:rPr>
-              <w:t xml:space="preserve">ollowing POC approval, planned responsibilities include training </w:t>
+              <w:t xml:space="preserve">Following POC approval, planned responsibilities include training </w:t>
             </w:r>
             <w:r>
               <w:rPr>
@@ -1779,6 +1813,53 @@
                 <w:szCs w:val="21"/>
               </w:rPr>
               <w:t xml:space="preserve"> </w:t>
+            </w:r>
+          </w:p>
+          <w:p>
+            <w:pPr>
+              <w:rPr>
+                <w:rFonts w:ascii="Calibri" w:hAnsi="Calibri" w:cs="Calibri"/>
+                <w:sz w:val="21"/>
+                <w:szCs w:val="21"/>
+              </w:rPr>
+            </w:pPr>
+            <w:r>
+              <w:rPr>
+                <w:rFonts w:ascii="Calibri" w:hAnsi="Calibri" w:cs="Calibri"/>
+                <w:b/>
+                <w:bCs/>
+                <w:sz w:val="21"/>
+                <w:szCs w:val="21"/>
+              </w:rPr>
+              <w:t>Cisco certified Technician</w:t>
+            </w:r>
+            <w:r>
+              <w:rPr>
+                <w:rFonts w:ascii="Calibri" w:hAnsi="Calibri" w:cs="Calibri"/>
+                <w:b/>
+                <w:bCs/>
+                <w:sz w:val="21"/>
+                <w:szCs w:val="21"/>
+              </w:rPr>
+              <w:t xml:space="preserve"> (CCT)</w:t>
+            </w:r>
+            <w:r>
+              <w:rPr>
+                <w:rFonts w:ascii="Calibri" w:hAnsi="Calibri" w:cs="Calibri"/>
+                <w:b/>
+                <w:bCs/>
+                <w:sz w:val="21"/>
+                <w:szCs w:val="21"/>
+              </w:rPr>
+              <w:t>:</w:t>
+            </w:r>
+            <w:r>
+              <w:rPr>
+                <w:rFonts w:ascii="Calibri" w:hAnsi="Calibri" w:cs="Calibri"/>
+                <w:sz w:val="21"/>
+                <w:szCs w:val="21"/>
+              </w:rPr>
+              <w:t xml:space="preserve"> Networking Fundamentals, OSI model, TCP/IP knowledge.</w:t>
             </w:r>
           </w:p>
           <w:p>

</xml_diff>